<commit_message>
update business cards front
</commit_message>
<xml_diff>
--- a/public/docs/business+cards+front.docx
+++ b/public/docs/business+cards+front.docx
@@ -37,23 +37,28 @@
           </w:tcPr>
           <w:p>
             <w:pPr>
-              <w:spacing w:before="111"/>
-              <w:ind w:left="126" w:right="126"/>
-            </w:pPr>
-          </w:p>
-          <w:p>
-            <w:pPr>
-              <w:ind w:left="126" w:right="126"/>
-            </w:pPr>
+              <w:ind w:left="126" w:right="126"/>
+            </w:pPr>
+            <w:r>
+              <w:t xml:space="preserve">  </w:t>
+            </w:r>
+          </w:p>
+          <w:p>
+            <w:pPr>
+              <w:ind w:left="126" w:right="126"/>
+            </w:pPr>
+            <w:r>
+              <w:t xml:space="preserve"> </w:t>
+            </w:r>
             <w:r>
               <w:rPr>
                 <w:noProof/>
               </w:rPr>
               <w:drawing>
-                <wp:inline distT="0" distB="0" distL="0" distR="0" wp14:anchorId="3051B228" wp14:editId="1867B7AB">
-                  <wp:extent cx="3181350" cy="1009015"/>
-                  <wp:effectExtent l="0" t="0" r="6350" b="0"/>
-                  <wp:docPr id="1002787149" name="Picture 1"/>
+                <wp:inline distT="0" distB="0" distL="0" distR="0" wp14:anchorId="7181477D" wp14:editId="07A08BB6">
+                  <wp:extent cx="2946400" cy="1154430"/>
+                  <wp:effectExtent l="0" t="0" r="0" b="1270"/>
+                  <wp:docPr id="759272480" name="Picture 1"/>
                   <wp:cNvGraphicFramePr>
                     <a:graphicFrameLocks xmlns:a="http://schemas.openxmlformats.org/drawingml/2006/main" noChangeAspect="1"/>
                   </wp:cNvGraphicFramePr>
@@ -61,17 +66,11 @@
                     <a:graphicData uri="http://schemas.openxmlformats.org/drawingml/2006/picture">
                       <pic:pic xmlns:pic="http://schemas.openxmlformats.org/drawingml/2006/picture">
                         <pic:nvPicPr>
-                          <pic:cNvPr id="0" name="Picture 1"/>
+                          <pic:cNvPr id="1433622250" name=""/>
                           <pic:cNvPicPr/>
                         </pic:nvPicPr>
                         <pic:blipFill>
-                          <a:blip r:embed="rId4">
-                            <a:extLst>
-                              <a:ext uri="{28A0092B-C50C-407E-A947-70E740481C1C}">
-                                <a14:useLocalDpi xmlns:a14="http://schemas.microsoft.com/office/drawing/2010/main" val="0"/>
-                              </a:ext>
-                            </a:extLst>
-                          </a:blip>
+                          <a:blip r:embed="rId4"/>
                           <a:stretch>
                             <a:fillRect/>
                           </a:stretch>
@@ -79,7 +78,7 @@
                         <pic:spPr>
                           <a:xfrm>
                             <a:off x="0" y="0"/>
-                            <a:ext cx="3181350" cy="1009015"/>
+                            <a:ext cx="2946400" cy="1154430"/>
                           </a:xfrm>
                           <a:prstGeom prst="rect">
                             <a:avLst/>
@@ -91,8 +90,56 @@
                 </wp:inline>
               </w:drawing>
             </w:r>
-            <w:r>
-              <w:t xml:space="preserve">         Hoosiers Working for Religious Freedom</w:t>
+          </w:p>
+          <w:p>
+            <w:pPr>
+              <w:ind w:left="126" w:right="126"/>
+            </w:pPr>
+            <w:r>
+              <w:t xml:space="preserve">        </w:t>
+            </w:r>
+            <w:r>
+              <w:t>Hoosiers Working for Religious Freedom</w:t>
+            </w:r>
+          </w:p>
+          <w:p>
+            <w:pPr>
+              <w:ind w:left="126" w:right="126"/>
+            </w:pPr>
+            <w:r>
+              <w:t xml:space="preserve"> </w:t>
+            </w:r>
+          </w:p>
+          <w:p>
+            <w:pPr>
+              <w:ind w:left="126" w:right="126"/>
+            </w:pPr>
+            <w:r>
+              <w:t xml:space="preserve"> </w:t>
+            </w:r>
+          </w:p>
+          <w:p>
+            <w:pPr>
+              <w:ind w:left="126" w:right="126"/>
+            </w:pPr>
+            <w:r>
+              <w:t xml:space="preserve"> </w:t>
+            </w:r>
+          </w:p>
+          <w:p>
+            <w:pPr>
+              <w:ind w:left="126" w:right="126"/>
+            </w:pPr>
+            <w:r>
+              <w:t xml:space="preserve"> </w:t>
+            </w:r>
+          </w:p>
+          <w:p>
+            <w:pPr>
+              <w:ind w:left="126" w:right="126"/>
+            </w:pPr>
+            <w:r>
+              <w:t xml:space="preserve"> </w:t>
             </w:r>
           </w:p>
         </w:tc>
@@ -102,23 +149,28 @@
           </w:tcPr>
           <w:p>
             <w:pPr>
-              <w:spacing w:before="111"/>
-              <w:ind w:left="126" w:right="126"/>
-            </w:pPr>
-          </w:p>
-          <w:p>
-            <w:pPr>
-              <w:ind w:left="126" w:right="126"/>
-            </w:pPr>
+              <w:ind w:left="126" w:right="126"/>
+            </w:pPr>
+            <w:r>
+              <w:t xml:space="preserve">  </w:t>
+            </w:r>
+          </w:p>
+          <w:p>
+            <w:pPr>
+              <w:ind w:left="126" w:right="126"/>
+            </w:pPr>
+            <w:r>
+              <w:t xml:space="preserve"> </w:t>
+            </w:r>
             <w:r>
               <w:rPr>
                 <w:noProof/>
               </w:rPr>
               <w:drawing>
-                <wp:inline distT="0" distB="0" distL="0" distR="0" wp14:anchorId="2E4BFC81" wp14:editId="72D4465F">
-                  <wp:extent cx="3181350" cy="1009015"/>
-                  <wp:effectExtent l="0" t="0" r="6350" b="0"/>
-                  <wp:docPr id="1860654853" name="Picture 1"/>
+                <wp:inline distT="0" distB="0" distL="0" distR="0" wp14:anchorId="4C15332A" wp14:editId="6458A49A">
+                  <wp:extent cx="2946400" cy="1154430"/>
+                  <wp:effectExtent l="0" t="0" r="0" b="1270"/>
+                  <wp:docPr id="1575506719" name="Picture 1"/>
                   <wp:cNvGraphicFramePr>
                     <a:graphicFrameLocks xmlns:a="http://schemas.openxmlformats.org/drawingml/2006/main" noChangeAspect="1"/>
                   </wp:cNvGraphicFramePr>
@@ -126,17 +178,11 @@
                     <a:graphicData uri="http://schemas.openxmlformats.org/drawingml/2006/picture">
                       <pic:pic xmlns:pic="http://schemas.openxmlformats.org/drawingml/2006/picture">
                         <pic:nvPicPr>
-                          <pic:cNvPr id="0" name="Picture 1"/>
+                          <pic:cNvPr id="1433622250" name=""/>
                           <pic:cNvPicPr/>
                         </pic:nvPicPr>
                         <pic:blipFill>
-                          <a:blip r:embed="rId4">
-                            <a:extLst>
-                              <a:ext uri="{28A0092B-C50C-407E-A947-70E740481C1C}">
-                                <a14:useLocalDpi xmlns:a14="http://schemas.microsoft.com/office/drawing/2010/main" val="0"/>
-                              </a:ext>
-                            </a:extLst>
-                          </a:blip>
+                          <a:blip r:embed="rId4"/>
                           <a:stretch>
                             <a:fillRect/>
                           </a:stretch>
@@ -144,7 +190,7 @@
                         <pic:spPr>
                           <a:xfrm>
                             <a:off x="0" y="0"/>
-                            <a:ext cx="3181350" cy="1009015"/>
+                            <a:ext cx="2946400" cy="1154430"/>
                           </a:xfrm>
                           <a:prstGeom prst="rect">
                             <a:avLst/>
@@ -156,9 +202,27 @@
                 </wp:inline>
               </w:drawing>
             </w:r>
-            <w:r>
-              <w:t xml:space="preserve">         Hoosiers Working for Religious Freedom</w:t>
-            </w:r>
+          </w:p>
+          <w:p>
+            <w:pPr>
+              <w:ind w:left="126" w:right="126"/>
+            </w:pPr>
+            <w:r>
+              <w:t xml:space="preserve">        Hoosiers Working for Religious Freedom</w:t>
+            </w:r>
+          </w:p>
+          <w:p>
+            <w:pPr>
+              <w:ind w:left="126" w:right="126"/>
+            </w:pPr>
+            <w:r>
+              <w:t xml:space="preserve"> </w:t>
+            </w:r>
+          </w:p>
+          <w:p>
+            <w:pPr>
+              <w:ind w:left="126" w:right="126"/>
+            </w:pPr>
           </w:p>
         </w:tc>
       </w:tr>
@@ -173,23 +237,28 @@
           </w:tcPr>
           <w:p>
             <w:pPr>
-              <w:spacing w:before="111"/>
-              <w:ind w:left="126" w:right="126"/>
-            </w:pPr>
-          </w:p>
-          <w:p>
-            <w:pPr>
-              <w:ind w:left="126" w:right="126"/>
-            </w:pPr>
+              <w:ind w:left="126" w:right="126"/>
+            </w:pPr>
+            <w:r>
+              <w:t xml:space="preserve">  </w:t>
+            </w:r>
+          </w:p>
+          <w:p>
+            <w:pPr>
+              <w:ind w:left="126" w:right="126"/>
+            </w:pPr>
+            <w:r>
+              <w:t xml:space="preserve"> </w:t>
+            </w:r>
             <w:r>
               <w:rPr>
                 <w:noProof/>
               </w:rPr>
               <w:drawing>
-                <wp:inline distT="0" distB="0" distL="0" distR="0" wp14:anchorId="0E12C7C6" wp14:editId="021BD17E">
-                  <wp:extent cx="3181350" cy="1009015"/>
-                  <wp:effectExtent l="0" t="0" r="6350" b="0"/>
-                  <wp:docPr id="455426560" name="Picture 1"/>
+                <wp:inline distT="0" distB="0" distL="0" distR="0" wp14:anchorId="6BE18181" wp14:editId="4532173E">
+                  <wp:extent cx="2946400" cy="1154430"/>
+                  <wp:effectExtent l="0" t="0" r="0" b="1270"/>
+                  <wp:docPr id="1903869060" name="Picture 1"/>
                   <wp:cNvGraphicFramePr>
                     <a:graphicFrameLocks xmlns:a="http://schemas.openxmlformats.org/drawingml/2006/main" noChangeAspect="1"/>
                   </wp:cNvGraphicFramePr>
@@ -197,17 +266,11 @@
                     <a:graphicData uri="http://schemas.openxmlformats.org/drawingml/2006/picture">
                       <pic:pic xmlns:pic="http://schemas.openxmlformats.org/drawingml/2006/picture">
                         <pic:nvPicPr>
-                          <pic:cNvPr id="0" name="Picture 1"/>
+                          <pic:cNvPr id="1433622250" name=""/>
                           <pic:cNvPicPr/>
                         </pic:nvPicPr>
                         <pic:blipFill>
-                          <a:blip r:embed="rId4">
-                            <a:extLst>
-                              <a:ext uri="{28A0092B-C50C-407E-A947-70E740481C1C}">
-                                <a14:useLocalDpi xmlns:a14="http://schemas.microsoft.com/office/drawing/2010/main" val="0"/>
-                              </a:ext>
-                            </a:extLst>
-                          </a:blip>
+                          <a:blip r:embed="rId4"/>
                           <a:stretch>
                             <a:fillRect/>
                           </a:stretch>
@@ -215,7 +278,7 @@
                         <pic:spPr>
                           <a:xfrm>
                             <a:off x="0" y="0"/>
-                            <a:ext cx="3181350" cy="1009015"/>
+                            <a:ext cx="2946400" cy="1154430"/>
                           </a:xfrm>
                           <a:prstGeom prst="rect">
                             <a:avLst/>
@@ -227,9 +290,27 @@
                 </wp:inline>
               </w:drawing>
             </w:r>
-            <w:r>
-              <w:t xml:space="preserve">         Hoosiers Working for Religious Freedom</w:t>
-            </w:r>
+          </w:p>
+          <w:p>
+            <w:pPr>
+              <w:ind w:left="126" w:right="126"/>
+            </w:pPr>
+            <w:r>
+              <w:t xml:space="preserve">        Hoosiers Working for Religious Freedom</w:t>
+            </w:r>
+          </w:p>
+          <w:p>
+            <w:pPr>
+              <w:ind w:left="126" w:right="126"/>
+            </w:pPr>
+            <w:r>
+              <w:t xml:space="preserve"> </w:t>
+            </w:r>
+          </w:p>
+          <w:p>
+            <w:pPr>
+              <w:ind w:left="126" w:right="126"/>
+            </w:pPr>
           </w:p>
         </w:tc>
         <w:tc>
@@ -238,23 +319,28 @@
           </w:tcPr>
           <w:p>
             <w:pPr>
-              <w:spacing w:before="111"/>
-              <w:ind w:left="126" w:right="126"/>
-            </w:pPr>
-          </w:p>
-          <w:p>
-            <w:pPr>
-              <w:ind w:left="126" w:right="126"/>
-            </w:pPr>
+              <w:ind w:left="126" w:right="126"/>
+            </w:pPr>
+            <w:r>
+              <w:t xml:space="preserve">  </w:t>
+            </w:r>
+          </w:p>
+          <w:p>
+            <w:pPr>
+              <w:ind w:left="126" w:right="126"/>
+            </w:pPr>
+            <w:r>
+              <w:t xml:space="preserve"> </w:t>
+            </w:r>
             <w:r>
               <w:rPr>
                 <w:noProof/>
               </w:rPr>
               <w:drawing>
-                <wp:inline distT="0" distB="0" distL="0" distR="0" wp14:anchorId="084C9AE3" wp14:editId="4B33EBA7">
-                  <wp:extent cx="3181350" cy="1009015"/>
-                  <wp:effectExtent l="0" t="0" r="6350" b="0"/>
-                  <wp:docPr id="1661510118" name="Picture 1"/>
+                <wp:inline distT="0" distB="0" distL="0" distR="0" wp14:anchorId="3DEA66E1" wp14:editId="6479A605">
+                  <wp:extent cx="2946400" cy="1154430"/>
+                  <wp:effectExtent l="0" t="0" r="0" b="1270"/>
+                  <wp:docPr id="239275599" name="Picture 1"/>
                   <wp:cNvGraphicFramePr>
                     <a:graphicFrameLocks xmlns:a="http://schemas.openxmlformats.org/drawingml/2006/main" noChangeAspect="1"/>
                   </wp:cNvGraphicFramePr>
@@ -262,17 +348,11 @@
                     <a:graphicData uri="http://schemas.openxmlformats.org/drawingml/2006/picture">
                       <pic:pic xmlns:pic="http://schemas.openxmlformats.org/drawingml/2006/picture">
                         <pic:nvPicPr>
-                          <pic:cNvPr id="0" name="Picture 1"/>
+                          <pic:cNvPr id="1433622250" name=""/>
                           <pic:cNvPicPr/>
                         </pic:nvPicPr>
                         <pic:blipFill>
-                          <a:blip r:embed="rId4">
-                            <a:extLst>
-                              <a:ext uri="{28A0092B-C50C-407E-A947-70E740481C1C}">
-                                <a14:useLocalDpi xmlns:a14="http://schemas.microsoft.com/office/drawing/2010/main" val="0"/>
-                              </a:ext>
-                            </a:extLst>
-                          </a:blip>
+                          <a:blip r:embed="rId4"/>
                           <a:stretch>
                             <a:fillRect/>
                           </a:stretch>
@@ -280,7 +360,7 @@
                         <pic:spPr>
                           <a:xfrm>
                             <a:off x="0" y="0"/>
-                            <a:ext cx="3181350" cy="1009015"/>
+                            <a:ext cx="2946400" cy="1154430"/>
                           </a:xfrm>
                           <a:prstGeom prst="rect">
                             <a:avLst/>
@@ -292,9 +372,27 @@
                 </wp:inline>
               </w:drawing>
             </w:r>
-            <w:r>
-              <w:t xml:space="preserve">          Hoosiers Working for Religious Freedom</w:t>
-            </w:r>
+          </w:p>
+          <w:p>
+            <w:pPr>
+              <w:ind w:left="126" w:right="126"/>
+            </w:pPr>
+            <w:r>
+              <w:t xml:space="preserve">        Hoosiers Working for Religious Freedom</w:t>
+            </w:r>
+          </w:p>
+          <w:p>
+            <w:pPr>
+              <w:ind w:left="126" w:right="126"/>
+            </w:pPr>
+            <w:r>
+              <w:t xml:space="preserve"> </w:t>
+            </w:r>
+          </w:p>
+          <w:p>
+            <w:pPr>
+              <w:ind w:left="126" w:right="126"/>
+            </w:pPr>
           </w:p>
         </w:tc>
       </w:tr>
@@ -309,23 +407,28 @@
           </w:tcPr>
           <w:p>
             <w:pPr>
-              <w:spacing w:before="111"/>
-              <w:ind w:left="126" w:right="126"/>
-            </w:pPr>
-          </w:p>
-          <w:p>
-            <w:pPr>
-              <w:ind w:left="126" w:right="126"/>
-            </w:pPr>
+              <w:ind w:left="126" w:right="126"/>
+            </w:pPr>
+            <w:r>
+              <w:t xml:space="preserve">  </w:t>
+            </w:r>
+          </w:p>
+          <w:p>
+            <w:pPr>
+              <w:ind w:left="126" w:right="126"/>
+            </w:pPr>
+            <w:r>
+              <w:t xml:space="preserve"> </w:t>
+            </w:r>
             <w:r>
               <w:rPr>
                 <w:noProof/>
               </w:rPr>
               <w:drawing>
-                <wp:inline distT="0" distB="0" distL="0" distR="0" wp14:anchorId="685E167D" wp14:editId="4A218981">
-                  <wp:extent cx="3181350" cy="1009015"/>
-                  <wp:effectExtent l="0" t="0" r="6350" b="0"/>
-                  <wp:docPr id="1722666839" name="Picture 1"/>
+                <wp:inline distT="0" distB="0" distL="0" distR="0" wp14:anchorId="69C6119B" wp14:editId="6E9E4797">
+                  <wp:extent cx="2946400" cy="1154430"/>
+                  <wp:effectExtent l="0" t="0" r="0" b="1270"/>
+                  <wp:docPr id="2012673390" name="Picture 1"/>
                   <wp:cNvGraphicFramePr>
                     <a:graphicFrameLocks xmlns:a="http://schemas.openxmlformats.org/drawingml/2006/main" noChangeAspect="1"/>
                   </wp:cNvGraphicFramePr>
@@ -333,17 +436,11 @@
                     <a:graphicData uri="http://schemas.openxmlformats.org/drawingml/2006/picture">
                       <pic:pic xmlns:pic="http://schemas.openxmlformats.org/drawingml/2006/picture">
                         <pic:nvPicPr>
-                          <pic:cNvPr id="0" name="Picture 1"/>
+                          <pic:cNvPr id="1433622250" name=""/>
                           <pic:cNvPicPr/>
                         </pic:nvPicPr>
                         <pic:blipFill>
-                          <a:blip r:embed="rId4">
-                            <a:extLst>
-                              <a:ext uri="{28A0092B-C50C-407E-A947-70E740481C1C}">
-                                <a14:useLocalDpi xmlns:a14="http://schemas.microsoft.com/office/drawing/2010/main" val="0"/>
-                              </a:ext>
-                            </a:extLst>
-                          </a:blip>
+                          <a:blip r:embed="rId4"/>
                           <a:stretch>
                             <a:fillRect/>
                           </a:stretch>
@@ -351,7 +448,7 @@
                         <pic:spPr>
                           <a:xfrm>
                             <a:off x="0" y="0"/>
-                            <a:ext cx="3181350" cy="1009015"/>
+                            <a:ext cx="2946400" cy="1154430"/>
                           </a:xfrm>
                           <a:prstGeom prst="rect">
                             <a:avLst/>
@@ -363,9 +460,27 @@
                 </wp:inline>
               </w:drawing>
             </w:r>
-            <w:r>
-              <w:t xml:space="preserve">         Hoosiers Working for Religious Freedom</w:t>
-            </w:r>
+          </w:p>
+          <w:p>
+            <w:pPr>
+              <w:ind w:left="126" w:right="126"/>
+            </w:pPr>
+            <w:r>
+              <w:t xml:space="preserve">        Hoosiers Working for Religious Freedom</w:t>
+            </w:r>
+          </w:p>
+          <w:p>
+            <w:pPr>
+              <w:ind w:left="126" w:right="126"/>
+            </w:pPr>
+            <w:r>
+              <w:t xml:space="preserve"> </w:t>
+            </w:r>
+          </w:p>
+          <w:p>
+            <w:pPr>
+              <w:ind w:left="126" w:right="126"/>
+            </w:pPr>
           </w:p>
         </w:tc>
         <w:tc>
@@ -374,23 +489,28 @@
           </w:tcPr>
           <w:p>
             <w:pPr>
-              <w:spacing w:before="111"/>
-              <w:ind w:left="126" w:right="126"/>
-            </w:pPr>
-          </w:p>
-          <w:p>
-            <w:pPr>
-              <w:ind w:left="126" w:right="126"/>
-            </w:pPr>
+              <w:ind w:left="126" w:right="126"/>
+            </w:pPr>
+            <w:r>
+              <w:t xml:space="preserve">  </w:t>
+            </w:r>
+          </w:p>
+          <w:p>
+            <w:pPr>
+              <w:ind w:left="126" w:right="126"/>
+            </w:pPr>
+            <w:r>
+              <w:t xml:space="preserve"> </w:t>
+            </w:r>
             <w:r>
               <w:rPr>
                 <w:noProof/>
               </w:rPr>
               <w:drawing>
-                <wp:inline distT="0" distB="0" distL="0" distR="0" wp14:anchorId="3ED1BB0B" wp14:editId="5CDBF70A">
-                  <wp:extent cx="3181350" cy="1009015"/>
-                  <wp:effectExtent l="0" t="0" r="6350" b="0"/>
-                  <wp:docPr id="1775364511" name="Picture 1"/>
+                <wp:inline distT="0" distB="0" distL="0" distR="0" wp14:anchorId="1017F1FB" wp14:editId="01AAE35C">
+                  <wp:extent cx="2946400" cy="1154430"/>
+                  <wp:effectExtent l="0" t="0" r="0" b="1270"/>
+                  <wp:docPr id="1222445808" name="Picture 1"/>
                   <wp:cNvGraphicFramePr>
                     <a:graphicFrameLocks xmlns:a="http://schemas.openxmlformats.org/drawingml/2006/main" noChangeAspect="1"/>
                   </wp:cNvGraphicFramePr>
@@ -398,17 +518,11 @@
                     <a:graphicData uri="http://schemas.openxmlformats.org/drawingml/2006/picture">
                       <pic:pic xmlns:pic="http://schemas.openxmlformats.org/drawingml/2006/picture">
                         <pic:nvPicPr>
-                          <pic:cNvPr id="0" name="Picture 1"/>
+                          <pic:cNvPr id="1433622250" name=""/>
                           <pic:cNvPicPr/>
                         </pic:nvPicPr>
                         <pic:blipFill>
-                          <a:blip r:embed="rId4">
-                            <a:extLst>
-                              <a:ext uri="{28A0092B-C50C-407E-A947-70E740481C1C}">
-                                <a14:useLocalDpi xmlns:a14="http://schemas.microsoft.com/office/drawing/2010/main" val="0"/>
-                              </a:ext>
-                            </a:extLst>
-                          </a:blip>
+                          <a:blip r:embed="rId4"/>
                           <a:stretch>
                             <a:fillRect/>
                           </a:stretch>
@@ -416,7 +530,7 @@
                         <pic:spPr>
                           <a:xfrm>
                             <a:off x="0" y="0"/>
-                            <a:ext cx="3181350" cy="1009015"/>
+                            <a:ext cx="2946400" cy="1154430"/>
                           </a:xfrm>
                           <a:prstGeom prst="rect">
                             <a:avLst/>
@@ -428,9 +542,27 @@
                 </wp:inline>
               </w:drawing>
             </w:r>
-            <w:r>
-              <w:t xml:space="preserve">          Hoosiers Working for Religious Freedom</w:t>
-            </w:r>
+          </w:p>
+          <w:p>
+            <w:pPr>
+              <w:ind w:left="126" w:right="126"/>
+            </w:pPr>
+            <w:r>
+              <w:t xml:space="preserve">        Hoosiers Working for Religious Freedom</w:t>
+            </w:r>
+          </w:p>
+          <w:p>
+            <w:pPr>
+              <w:ind w:left="126" w:right="126"/>
+            </w:pPr>
+            <w:r>
+              <w:t xml:space="preserve"> </w:t>
+            </w:r>
+          </w:p>
+          <w:p>
+            <w:pPr>
+              <w:ind w:left="126" w:right="126"/>
+            </w:pPr>
           </w:p>
         </w:tc>
       </w:tr>
@@ -445,23 +577,28 @@
           </w:tcPr>
           <w:p>
             <w:pPr>
-              <w:spacing w:before="111"/>
-              <w:ind w:left="126" w:right="126"/>
-            </w:pPr>
-          </w:p>
-          <w:p>
-            <w:pPr>
-              <w:ind w:left="126" w:right="126"/>
-            </w:pPr>
+              <w:ind w:left="126" w:right="126"/>
+            </w:pPr>
+            <w:r>
+              <w:t xml:space="preserve">  </w:t>
+            </w:r>
+          </w:p>
+          <w:p>
+            <w:pPr>
+              <w:ind w:left="126" w:right="126"/>
+            </w:pPr>
+            <w:r>
+              <w:t xml:space="preserve"> </w:t>
+            </w:r>
             <w:r>
               <w:rPr>
                 <w:noProof/>
               </w:rPr>
               <w:drawing>
-                <wp:inline distT="0" distB="0" distL="0" distR="0" wp14:anchorId="757DF244" wp14:editId="335A0F5D">
-                  <wp:extent cx="3181350" cy="1009015"/>
-                  <wp:effectExtent l="0" t="0" r="6350" b="0"/>
-                  <wp:docPr id="634974792" name="Picture 1"/>
+                <wp:inline distT="0" distB="0" distL="0" distR="0" wp14:anchorId="31FE1FF0" wp14:editId="7D1BF77A">
+                  <wp:extent cx="2946400" cy="1154430"/>
+                  <wp:effectExtent l="0" t="0" r="0" b="1270"/>
+                  <wp:docPr id="103140675" name="Picture 1"/>
                   <wp:cNvGraphicFramePr>
                     <a:graphicFrameLocks xmlns:a="http://schemas.openxmlformats.org/drawingml/2006/main" noChangeAspect="1"/>
                   </wp:cNvGraphicFramePr>
@@ -469,17 +606,11 @@
                     <a:graphicData uri="http://schemas.openxmlformats.org/drawingml/2006/picture">
                       <pic:pic xmlns:pic="http://schemas.openxmlformats.org/drawingml/2006/picture">
                         <pic:nvPicPr>
-                          <pic:cNvPr id="0" name="Picture 1"/>
+                          <pic:cNvPr id="1433622250" name=""/>
                           <pic:cNvPicPr/>
                         </pic:nvPicPr>
                         <pic:blipFill>
-                          <a:blip r:embed="rId4">
-                            <a:extLst>
-                              <a:ext uri="{28A0092B-C50C-407E-A947-70E740481C1C}">
-                                <a14:useLocalDpi xmlns:a14="http://schemas.microsoft.com/office/drawing/2010/main" val="0"/>
-                              </a:ext>
-                            </a:extLst>
-                          </a:blip>
+                          <a:blip r:embed="rId4"/>
                           <a:stretch>
                             <a:fillRect/>
                           </a:stretch>
@@ -487,7 +618,7 @@
                         <pic:spPr>
                           <a:xfrm>
                             <a:off x="0" y="0"/>
-                            <a:ext cx="3181350" cy="1009015"/>
+                            <a:ext cx="2946400" cy="1154430"/>
                           </a:xfrm>
                           <a:prstGeom prst="rect">
                             <a:avLst/>
@@ -499,9 +630,27 @@
                 </wp:inline>
               </w:drawing>
             </w:r>
-            <w:r>
-              <w:t xml:space="preserve">         Hoosiers Working for Religious Freedom</w:t>
-            </w:r>
+          </w:p>
+          <w:p>
+            <w:pPr>
+              <w:ind w:left="126" w:right="126"/>
+            </w:pPr>
+            <w:r>
+              <w:t xml:space="preserve">        Hoosiers Working for Religious Freedom</w:t>
+            </w:r>
+          </w:p>
+          <w:p>
+            <w:pPr>
+              <w:ind w:left="126" w:right="126"/>
+            </w:pPr>
+            <w:r>
+              <w:t xml:space="preserve"> </w:t>
+            </w:r>
+          </w:p>
+          <w:p>
+            <w:pPr>
+              <w:ind w:left="126" w:right="126"/>
+            </w:pPr>
           </w:p>
         </w:tc>
         <w:tc>
@@ -510,23 +659,28 @@
           </w:tcPr>
           <w:p>
             <w:pPr>
-              <w:spacing w:before="111"/>
-              <w:ind w:left="126" w:right="126"/>
-            </w:pPr>
-          </w:p>
-          <w:p>
-            <w:pPr>
-              <w:ind w:left="126" w:right="126"/>
-            </w:pPr>
+              <w:ind w:left="126" w:right="126"/>
+            </w:pPr>
+            <w:r>
+              <w:t xml:space="preserve">  </w:t>
+            </w:r>
+          </w:p>
+          <w:p>
+            <w:pPr>
+              <w:ind w:left="126" w:right="126"/>
+            </w:pPr>
+            <w:r>
+              <w:t xml:space="preserve"> </w:t>
+            </w:r>
             <w:r>
               <w:rPr>
                 <w:noProof/>
               </w:rPr>
               <w:drawing>
-                <wp:inline distT="0" distB="0" distL="0" distR="0" wp14:anchorId="5B862A81" wp14:editId="4E1D85B7">
-                  <wp:extent cx="3181350" cy="1009015"/>
-                  <wp:effectExtent l="0" t="0" r="6350" b="0"/>
-                  <wp:docPr id="467848027" name="Picture 1"/>
+                <wp:inline distT="0" distB="0" distL="0" distR="0" wp14:anchorId="75EC6055" wp14:editId="08388974">
+                  <wp:extent cx="2946400" cy="1154430"/>
+                  <wp:effectExtent l="0" t="0" r="0" b="1270"/>
+                  <wp:docPr id="401230399" name="Picture 1"/>
                   <wp:cNvGraphicFramePr>
                     <a:graphicFrameLocks xmlns:a="http://schemas.openxmlformats.org/drawingml/2006/main" noChangeAspect="1"/>
                   </wp:cNvGraphicFramePr>
@@ -534,17 +688,11 @@
                     <a:graphicData uri="http://schemas.openxmlformats.org/drawingml/2006/picture">
                       <pic:pic xmlns:pic="http://schemas.openxmlformats.org/drawingml/2006/picture">
                         <pic:nvPicPr>
-                          <pic:cNvPr id="0" name="Picture 1"/>
+                          <pic:cNvPr id="1433622250" name=""/>
                           <pic:cNvPicPr/>
                         </pic:nvPicPr>
                         <pic:blipFill>
-                          <a:blip r:embed="rId4">
-                            <a:extLst>
-                              <a:ext uri="{28A0092B-C50C-407E-A947-70E740481C1C}">
-                                <a14:useLocalDpi xmlns:a14="http://schemas.microsoft.com/office/drawing/2010/main" val="0"/>
-                              </a:ext>
-                            </a:extLst>
-                          </a:blip>
+                          <a:blip r:embed="rId4"/>
                           <a:stretch>
                             <a:fillRect/>
                           </a:stretch>
@@ -552,7 +700,7 @@
                         <pic:spPr>
                           <a:xfrm>
                             <a:off x="0" y="0"/>
-                            <a:ext cx="3181350" cy="1009015"/>
+                            <a:ext cx="2946400" cy="1154430"/>
                           </a:xfrm>
                           <a:prstGeom prst="rect">
                             <a:avLst/>
@@ -564,9 +712,27 @@
                 </wp:inline>
               </w:drawing>
             </w:r>
-            <w:r>
-              <w:t xml:space="preserve">         Hoosiers Working for Religious Freedom</w:t>
-            </w:r>
+          </w:p>
+          <w:p>
+            <w:pPr>
+              <w:ind w:left="126" w:right="126"/>
+            </w:pPr>
+            <w:r>
+              <w:t xml:space="preserve">        Hoosiers Working for Religious Freedom</w:t>
+            </w:r>
+          </w:p>
+          <w:p>
+            <w:pPr>
+              <w:ind w:left="126" w:right="126"/>
+            </w:pPr>
+            <w:r>
+              <w:t xml:space="preserve"> </w:t>
+            </w:r>
+          </w:p>
+          <w:p>
+            <w:pPr>
+              <w:ind w:left="126" w:right="126"/>
+            </w:pPr>
           </w:p>
         </w:tc>
       </w:tr>
@@ -581,23 +747,28 @@
           </w:tcPr>
           <w:p>
             <w:pPr>
-              <w:spacing w:before="111"/>
-              <w:ind w:left="126" w:right="126"/>
-            </w:pPr>
-          </w:p>
-          <w:p>
-            <w:pPr>
-              <w:ind w:left="126" w:right="126"/>
-            </w:pPr>
+              <w:ind w:left="126" w:right="126"/>
+            </w:pPr>
+            <w:r>
+              <w:t xml:space="preserve">  </w:t>
+            </w:r>
+          </w:p>
+          <w:p>
+            <w:pPr>
+              <w:ind w:left="126" w:right="126"/>
+            </w:pPr>
+            <w:r>
+              <w:t xml:space="preserve"> </w:t>
+            </w:r>
             <w:r>
               <w:rPr>
                 <w:noProof/>
               </w:rPr>
               <w:drawing>
-                <wp:inline distT="0" distB="0" distL="0" distR="0" wp14:anchorId="5D08EABF" wp14:editId="0BAE668B">
-                  <wp:extent cx="3181350" cy="1009015"/>
-                  <wp:effectExtent l="0" t="0" r="6350" b="0"/>
-                  <wp:docPr id="216105823" name="Picture 1"/>
+                <wp:inline distT="0" distB="0" distL="0" distR="0" wp14:anchorId="145F2B55" wp14:editId="220E09D0">
+                  <wp:extent cx="2946400" cy="1154430"/>
+                  <wp:effectExtent l="0" t="0" r="0" b="1270"/>
+                  <wp:docPr id="1148980366" name="Picture 1"/>
                   <wp:cNvGraphicFramePr>
                     <a:graphicFrameLocks xmlns:a="http://schemas.openxmlformats.org/drawingml/2006/main" noChangeAspect="1"/>
                   </wp:cNvGraphicFramePr>
@@ -605,17 +776,11 @@
                     <a:graphicData uri="http://schemas.openxmlformats.org/drawingml/2006/picture">
                       <pic:pic xmlns:pic="http://schemas.openxmlformats.org/drawingml/2006/picture">
                         <pic:nvPicPr>
-                          <pic:cNvPr id="0" name="Picture 1"/>
+                          <pic:cNvPr id="1433622250" name=""/>
                           <pic:cNvPicPr/>
                         </pic:nvPicPr>
                         <pic:blipFill>
-                          <a:blip r:embed="rId4">
-                            <a:extLst>
-                              <a:ext uri="{28A0092B-C50C-407E-A947-70E740481C1C}">
-                                <a14:useLocalDpi xmlns:a14="http://schemas.microsoft.com/office/drawing/2010/main" val="0"/>
-                              </a:ext>
-                            </a:extLst>
-                          </a:blip>
+                          <a:blip r:embed="rId4"/>
                           <a:stretch>
                             <a:fillRect/>
                           </a:stretch>
@@ -623,7 +788,7 @@
                         <pic:spPr>
                           <a:xfrm>
                             <a:off x="0" y="0"/>
-                            <a:ext cx="3181350" cy="1009015"/>
+                            <a:ext cx="2946400" cy="1154430"/>
                           </a:xfrm>
                           <a:prstGeom prst="rect">
                             <a:avLst/>
@@ -635,9 +800,27 @@
                 </wp:inline>
               </w:drawing>
             </w:r>
-            <w:r>
-              <w:t xml:space="preserve">         Hoosiers Working for Religious Freedom</w:t>
-            </w:r>
+          </w:p>
+          <w:p>
+            <w:pPr>
+              <w:ind w:left="126" w:right="126"/>
+            </w:pPr>
+            <w:r>
+              <w:t xml:space="preserve">        Hoosiers Working for Religious Freedom</w:t>
+            </w:r>
+          </w:p>
+          <w:p>
+            <w:pPr>
+              <w:ind w:left="126" w:right="126"/>
+            </w:pPr>
+            <w:r>
+              <w:t xml:space="preserve"> </w:t>
+            </w:r>
+          </w:p>
+          <w:p>
+            <w:pPr>
+              <w:ind w:left="126" w:right="126"/>
+            </w:pPr>
           </w:p>
         </w:tc>
         <w:tc>
@@ -646,23 +829,28 @@
           </w:tcPr>
           <w:p>
             <w:pPr>
-              <w:spacing w:before="111"/>
-              <w:ind w:left="126" w:right="126"/>
-            </w:pPr>
-          </w:p>
-          <w:p>
-            <w:pPr>
-              <w:ind w:left="126" w:right="126"/>
-            </w:pPr>
+              <w:ind w:left="126" w:right="126"/>
+            </w:pPr>
+            <w:r>
+              <w:t xml:space="preserve">  </w:t>
+            </w:r>
+          </w:p>
+          <w:p>
+            <w:pPr>
+              <w:ind w:left="126" w:right="126"/>
+            </w:pPr>
+            <w:r>
+              <w:t xml:space="preserve"> </w:t>
+            </w:r>
             <w:r>
               <w:rPr>
                 <w:noProof/>
               </w:rPr>
               <w:drawing>
-                <wp:inline distT="0" distB="0" distL="0" distR="0" wp14:anchorId="23968922" wp14:editId="43DEB3D5">
-                  <wp:extent cx="3181350" cy="1009015"/>
-                  <wp:effectExtent l="0" t="0" r="6350" b="0"/>
-                  <wp:docPr id="1372854074" name="Picture 1"/>
+                <wp:inline distT="0" distB="0" distL="0" distR="0" wp14:anchorId="54F1A940" wp14:editId="55F6CC92">
+                  <wp:extent cx="2946400" cy="1154430"/>
+                  <wp:effectExtent l="0" t="0" r="0" b="1270"/>
+                  <wp:docPr id="1620977656" name="Picture 1"/>
                   <wp:cNvGraphicFramePr>
                     <a:graphicFrameLocks xmlns:a="http://schemas.openxmlformats.org/drawingml/2006/main" noChangeAspect="1"/>
                   </wp:cNvGraphicFramePr>
@@ -670,17 +858,11 @@
                     <a:graphicData uri="http://schemas.openxmlformats.org/drawingml/2006/picture">
                       <pic:pic xmlns:pic="http://schemas.openxmlformats.org/drawingml/2006/picture">
                         <pic:nvPicPr>
-                          <pic:cNvPr id="0" name="Picture 1"/>
+                          <pic:cNvPr id="1433622250" name=""/>
                           <pic:cNvPicPr/>
                         </pic:nvPicPr>
                         <pic:blipFill>
-                          <a:blip r:embed="rId4">
-                            <a:extLst>
-                              <a:ext uri="{28A0092B-C50C-407E-A947-70E740481C1C}">
-                                <a14:useLocalDpi xmlns:a14="http://schemas.microsoft.com/office/drawing/2010/main" val="0"/>
-                              </a:ext>
-                            </a:extLst>
-                          </a:blip>
+                          <a:blip r:embed="rId4"/>
                           <a:stretch>
                             <a:fillRect/>
                           </a:stretch>
@@ -688,7 +870,7 @@
                         <pic:spPr>
                           <a:xfrm>
                             <a:off x="0" y="0"/>
-                            <a:ext cx="3181350" cy="1009015"/>
+                            <a:ext cx="2946400" cy="1154430"/>
                           </a:xfrm>
                           <a:prstGeom prst="rect">
                             <a:avLst/>
@@ -700,9 +882,27 @@
                 </wp:inline>
               </w:drawing>
             </w:r>
-            <w:r>
-              <w:t xml:space="preserve">         Hoosiers Working for Religious Freedom</w:t>
-            </w:r>
+          </w:p>
+          <w:p>
+            <w:pPr>
+              <w:ind w:left="126" w:right="126"/>
+            </w:pPr>
+            <w:r>
+              <w:t xml:space="preserve">        Hoosiers Working for Religious Freedom</w:t>
+            </w:r>
+          </w:p>
+          <w:p>
+            <w:pPr>
+              <w:ind w:left="126" w:right="126"/>
+            </w:pPr>
+            <w:r>
+              <w:t xml:space="preserve"> </w:t>
+            </w:r>
+          </w:p>
+          <w:p>
+            <w:pPr>
+              <w:ind w:left="126" w:right="126"/>
+            </w:pPr>
           </w:p>
         </w:tc>
       </w:tr>
@@ -1134,7 +1334,7 @@
     <w:link w:val="Heading1Char"/>
     <w:uiPriority w:val="9"/>
     <w:qFormat/>
-    <w:rsid w:val="004B04F7"/>
+    <w:rsid w:val="008F1F32"/>
     <w:pPr>
       <w:keepNext/>
       <w:keepLines/>
@@ -1157,7 +1357,7 @@
     <w:semiHidden/>
     <w:unhideWhenUsed/>
     <w:qFormat/>
-    <w:rsid w:val="004B04F7"/>
+    <w:rsid w:val="008F1F32"/>
     <w:pPr>
       <w:keepNext/>
       <w:keepLines/>
@@ -1180,7 +1380,7 @@
     <w:semiHidden/>
     <w:unhideWhenUsed/>
     <w:qFormat/>
-    <w:rsid w:val="004B04F7"/>
+    <w:rsid w:val="008F1F32"/>
     <w:pPr>
       <w:keepNext/>
       <w:keepLines/>
@@ -1203,7 +1403,7 @@
     <w:semiHidden/>
     <w:unhideWhenUsed/>
     <w:qFormat/>
-    <w:rsid w:val="004B04F7"/>
+    <w:rsid w:val="008F1F32"/>
     <w:pPr>
       <w:keepNext/>
       <w:keepLines/>
@@ -1226,7 +1426,7 @@
     <w:semiHidden/>
     <w:unhideWhenUsed/>
     <w:qFormat/>
-    <w:rsid w:val="004B04F7"/>
+    <w:rsid w:val="008F1F32"/>
     <w:pPr>
       <w:keepNext/>
       <w:keepLines/>
@@ -1247,7 +1447,7 @@
     <w:semiHidden/>
     <w:unhideWhenUsed/>
     <w:qFormat/>
-    <w:rsid w:val="004B04F7"/>
+    <w:rsid w:val="008F1F32"/>
     <w:pPr>
       <w:keepNext/>
       <w:keepLines/>
@@ -1270,7 +1470,7 @@
     <w:semiHidden/>
     <w:unhideWhenUsed/>
     <w:qFormat/>
-    <w:rsid w:val="004B04F7"/>
+    <w:rsid w:val="008F1F32"/>
     <w:pPr>
       <w:keepNext/>
       <w:keepLines/>
@@ -1291,7 +1491,7 @@
     <w:semiHidden/>
     <w:unhideWhenUsed/>
     <w:qFormat/>
-    <w:rsid w:val="004B04F7"/>
+    <w:rsid w:val="008F1F32"/>
     <w:pPr>
       <w:keepNext/>
       <w:keepLines/>
@@ -1314,7 +1514,7 @@
     <w:semiHidden/>
     <w:unhideWhenUsed/>
     <w:qFormat/>
-    <w:rsid w:val="004B04F7"/>
+    <w:rsid w:val="008F1F32"/>
     <w:pPr>
       <w:keepNext/>
       <w:keepLines/>
@@ -1358,7 +1558,7 @@
     <w:basedOn w:val="DefaultParagraphFont"/>
     <w:link w:val="Heading1"/>
     <w:uiPriority w:val="9"/>
-    <w:rsid w:val="004B04F7"/>
+    <w:rsid w:val="008F1F32"/>
     <w:rPr>
       <w:rFonts w:asciiTheme="majorHAnsi" w:eastAsiaTheme="majorEastAsia" w:hAnsiTheme="majorHAnsi" w:cstheme="majorBidi"/>
       <w:color w:val="0F4761" w:themeColor="accent1" w:themeShade="BF"/>
@@ -1372,7 +1572,7 @@
     <w:link w:val="Heading2"/>
     <w:uiPriority w:val="9"/>
     <w:semiHidden/>
-    <w:rsid w:val="004B04F7"/>
+    <w:rsid w:val="008F1F32"/>
     <w:rPr>
       <w:rFonts w:asciiTheme="majorHAnsi" w:eastAsiaTheme="majorEastAsia" w:hAnsiTheme="majorHAnsi" w:cstheme="majorBidi"/>
       <w:color w:val="0F4761" w:themeColor="accent1" w:themeShade="BF"/>
@@ -1386,7 +1586,7 @@
     <w:link w:val="Heading3"/>
     <w:uiPriority w:val="9"/>
     <w:semiHidden/>
-    <w:rsid w:val="004B04F7"/>
+    <w:rsid w:val="008F1F32"/>
     <w:rPr>
       <w:rFonts w:eastAsiaTheme="majorEastAsia" w:cstheme="majorBidi"/>
       <w:color w:val="0F4761" w:themeColor="accent1" w:themeShade="BF"/>
@@ -1400,7 +1600,7 @@
     <w:link w:val="Heading4"/>
     <w:uiPriority w:val="9"/>
     <w:semiHidden/>
-    <w:rsid w:val="004B04F7"/>
+    <w:rsid w:val="008F1F32"/>
     <w:rPr>
       <w:rFonts w:eastAsiaTheme="majorEastAsia" w:cstheme="majorBidi"/>
       <w:i/>
@@ -1414,7 +1614,7 @@
     <w:link w:val="Heading5"/>
     <w:uiPriority w:val="9"/>
     <w:semiHidden/>
-    <w:rsid w:val="004B04F7"/>
+    <w:rsid w:val="008F1F32"/>
     <w:rPr>
       <w:rFonts w:eastAsiaTheme="majorEastAsia" w:cstheme="majorBidi"/>
       <w:color w:val="0F4761" w:themeColor="accent1" w:themeShade="BF"/>
@@ -1426,7 +1626,7 @@
     <w:link w:val="Heading6"/>
     <w:uiPriority w:val="9"/>
     <w:semiHidden/>
-    <w:rsid w:val="004B04F7"/>
+    <w:rsid w:val="008F1F32"/>
     <w:rPr>
       <w:rFonts w:eastAsiaTheme="majorEastAsia" w:cstheme="majorBidi"/>
       <w:i/>
@@ -1440,7 +1640,7 @@
     <w:link w:val="Heading7"/>
     <w:uiPriority w:val="9"/>
     <w:semiHidden/>
-    <w:rsid w:val="004B04F7"/>
+    <w:rsid w:val="008F1F32"/>
     <w:rPr>
       <w:rFonts w:eastAsiaTheme="majorEastAsia" w:cstheme="majorBidi"/>
       <w:color w:val="595959" w:themeColor="text1" w:themeTint="A6"/>
@@ -1452,7 +1652,7 @@
     <w:link w:val="Heading8"/>
     <w:uiPriority w:val="9"/>
     <w:semiHidden/>
-    <w:rsid w:val="004B04F7"/>
+    <w:rsid w:val="008F1F32"/>
     <w:rPr>
       <w:rFonts w:eastAsiaTheme="majorEastAsia" w:cstheme="majorBidi"/>
       <w:i/>
@@ -1466,7 +1666,7 @@
     <w:link w:val="Heading9"/>
     <w:uiPriority w:val="9"/>
     <w:semiHidden/>
-    <w:rsid w:val="004B04F7"/>
+    <w:rsid w:val="008F1F32"/>
     <w:rPr>
       <w:rFonts w:eastAsiaTheme="majorEastAsia" w:cstheme="majorBidi"/>
       <w:color w:val="272727" w:themeColor="text1" w:themeTint="D8"/>
@@ -1479,7 +1679,7 @@
     <w:link w:val="TitleChar"/>
     <w:uiPriority w:val="10"/>
     <w:qFormat/>
-    <w:rsid w:val="004B04F7"/>
+    <w:rsid w:val="008F1F32"/>
     <w:pPr>
       <w:spacing w:after="80" w:line="240" w:lineRule="auto"/>
       <w:contextualSpacing/>
@@ -1497,7 +1697,7 @@
     <w:basedOn w:val="DefaultParagraphFont"/>
     <w:link w:val="Title"/>
     <w:uiPriority w:val="10"/>
-    <w:rsid w:val="004B04F7"/>
+    <w:rsid w:val="008F1F32"/>
     <w:rPr>
       <w:rFonts w:asciiTheme="majorHAnsi" w:eastAsiaTheme="majorEastAsia" w:hAnsiTheme="majorHAnsi" w:cstheme="majorBidi"/>
       <w:spacing w:val="-10"/>
@@ -1513,7 +1713,7 @@
     <w:link w:val="SubtitleChar"/>
     <w:uiPriority w:val="11"/>
     <w:qFormat/>
-    <w:rsid w:val="004B04F7"/>
+    <w:rsid w:val="008F1F32"/>
     <w:pPr>
       <w:numPr>
         <w:ilvl w:val="1"/>
@@ -1532,7 +1732,7 @@
     <w:basedOn w:val="DefaultParagraphFont"/>
     <w:link w:val="Subtitle"/>
     <w:uiPriority w:val="11"/>
-    <w:rsid w:val="004B04F7"/>
+    <w:rsid w:val="008F1F32"/>
     <w:rPr>
       <w:rFonts w:eastAsiaTheme="majorEastAsia" w:cstheme="majorBidi"/>
       <w:color w:val="595959" w:themeColor="text1" w:themeTint="A6"/>
@@ -1548,7 +1748,7 @@
     <w:link w:val="QuoteChar"/>
     <w:uiPriority w:val="29"/>
     <w:qFormat/>
-    <w:rsid w:val="004B04F7"/>
+    <w:rsid w:val="008F1F32"/>
     <w:pPr>
       <w:spacing w:before="160"/>
       <w:jc w:val="center"/>
@@ -1564,7 +1764,7 @@
     <w:basedOn w:val="DefaultParagraphFont"/>
     <w:link w:val="Quote"/>
     <w:uiPriority w:val="29"/>
-    <w:rsid w:val="004B04F7"/>
+    <w:rsid w:val="008F1F32"/>
     <w:rPr>
       <w:i/>
       <w:iCs/>
@@ -1576,7 +1776,7 @@
     <w:basedOn w:val="Normal"/>
     <w:uiPriority w:val="34"/>
     <w:qFormat/>
-    <w:rsid w:val="004B04F7"/>
+    <w:rsid w:val="008F1F32"/>
     <w:pPr>
       <w:ind w:left="720"/>
       <w:contextualSpacing/>
@@ -1587,7 +1787,7 @@
     <w:basedOn w:val="DefaultParagraphFont"/>
     <w:uiPriority w:val="21"/>
     <w:qFormat/>
-    <w:rsid w:val="004B04F7"/>
+    <w:rsid w:val="008F1F32"/>
     <w:rPr>
       <w:i/>
       <w:iCs/>
@@ -1601,7 +1801,7 @@
     <w:link w:val="IntenseQuoteChar"/>
     <w:uiPriority w:val="30"/>
     <w:qFormat/>
-    <w:rsid w:val="004B04F7"/>
+    <w:rsid w:val="008F1F32"/>
     <w:pPr>
       <w:pBdr>
         <w:top w:val="single" w:sz="4" w:space="10" w:color="0F4761" w:themeColor="accent1" w:themeShade="BF"/>
@@ -1622,7 +1822,7 @@
     <w:basedOn w:val="DefaultParagraphFont"/>
     <w:link w:val="IntenseQuote"/>
     <w:uiPriority w:val="30"/>
-    <w:rsid w:val="004B04F7"/>
+    <w:rsid w:val="008F1F32"/>
     <w:rPr>
       <w:i/>
       <w:iCs/>
@@ -1634,7 +1834,7 @@
     <w:basedOn w:val="DefaultParagraphFont"/>
     <w:uiPriority w:val="32"/>
     <w:qFormat/>
-    <w:rsid w:val="004B04F7"/>
+    <w:rsid w:val="008F1F32"/>
     <w:rPr>
       <w:b/>
       <w:bCs/>
@@ -1647,7 +1847,7 @@
     <w:name w:val="Table Grid"/>
     <w:basedOn w:val="TableNormal"/>
     <w:uiPriority w:val="39"/>
-    <w:rsid w:val="004B04F7"/>
+    <w:rsid w:val="008F1F32"/>
     <w:pPr>
       <w:spacing w:after="0" w:line="240" w:lineRule="auto"/>
     </w:pPr>
@@ -1763,7 +1963,7 @@
         <a:latin typeface="Aptos" panose="02110004020202020204"/>
         <a:ea typeface=""/>
         <a:cs typeface=""/>
-        <a:font script="Jpan" typeface="游ゴシック"/>
+        <a:font script="Jpan" typeface="游明朝"/>
         <a:font script="Hang" typeface="맑은 고딕"/>
         <a:font script="Hans" typeface="等线"/>
         <a:font script="Hant" typeface="新細明體"/>
@@ -1871,13 +2071,6 @@
         </a:gradFill>
       </a:fillStyleLst>
       <a:lnStyleLst>
-        <a:ln w="6350" cap="flat" cmpd="sng" algn="ctr">
-          <a:solidFill>
-            <a:schemeClr val="phClr"/>
-          </a:solidFill>
-          <a:prstDash val="solid"/>
-          <a:miter lim="800000"/>
-        </a:ln>
         <a:ln w="12700" cap="flat" cmpd="sng" algn="ctr">
           <a:solidFill>
             <a:schemeClr val="phClr"/>
@@ -1886,6 +2079,13 @@
           <a:miter lim="800000"/>
         </a:ln>
         <a:ln w="19050" cap="flat" cmpd="sng" algn="ctr">
+          <a:solidFill>
+            <a:schemeClr val="phClr"/>
+          </a:solidFill>
+          <a:prstDash val="solid"/>
+          <a:miter lim="800000"/>
+        </a:ln>
+        <a:ln w="25400" cap="flat" cmpd="sng" algn="ctr">
           <a:solidFill>
             <a:schemeClr val="phClr"/>
           </a:solidFill>
@@ -1950,11 +2150,31 @@
       </a:bgFillStyleLst>
     </a:fmtScheme>
   </a:themeElements>
-  <a:objectDefaults/>
+  <a:objectDefaults>
+    <a:lnDef>
+      <a:spPr/>
+      <a:bodyPr/>
+      <a:lstStyle/>
+      <a:style>
+        <a:lnRef idx="2">
+          <a:schemeClr val="accent1"/>
+        </a:lnRef>
+        <a:fillRef idx="0">
+          <a:schemeClr val="accent1"/>
+        </a:fillRef>
+        <a:effectRef idx="1">
+          <a:schemeClr val="accent1"/>
+        </a:effectRef>
+        <a:fontRef idx="minor">
+          <a:schemeClr val="tx1"/>
+        </a:fontRef>
+      </a:style>
+    </a:lnDef>
+  </a:objectDefaults>
   <a:extraClrSchemeLst/>
   <a:extLst>
     <a:ext uri="{05A4C25C-085E-4340-85A3-A5531E510DB2}">
-      <thm15:themeFamily xmlns:thm15="http://schemas.microsoft.com/office/thememl/2012/main" name="Office Theme" id="{62F939B6-93AF-4DB8-9C6B-D6C7DFDC589F}" vid="{4A3C46E8-61CC-4603-A589-7422A47A8E4A}"/>
+      <thm15:themeFamily xmlns:thm15="http://schemas.microsoft.com/office/thememl/2012/main" name="Office Theme" id="{2E142A2C-CD16-42D6-873A-C26D2A0506FA}" vid="{1BDDFF52-6CD6-40A5-AB3C-68EB2F1E4D0A}"/>
     </a:ext>
   </a:extLst>
 </a:theme>

</xml_diff>